<commit_message>
Add new version 0.1.0 and icon project
</commit_message>
<xml_diff>
--- a/docs/ITSM_System_Documentation.docx
+++ b/docs/ITSM_System_Documentation.docx
@@ -3337,7 +3337,34 @@
         <w:rPr>
           <w:rStyle w:val="VerbatimChar"/>
         </w:rPr>
-        <w:t xml:space="preserve">│   └── index.php          # точка входу (front controller)</w:t>
+        <w:t xml:space="preserve">│   ├── index.php          # точка входу (front controller)</w:t>
+      </w:r>
+      <w:r>
+        <w:br/>
+      </w:r>
+      <w:r>
+        <w:rPr>
+          <w:rStyle w:val="VerbatimChar"/>
+        </w:rPr>
+        <w:t xml:space="preserve">│   ├── favicon.ico        # іконка застосунку (мультирозмірна, класичний favicon)</w:t>
+      </w:r>
+      <w:r>
+        <w:br/>
+      </w:r>
+      <w:r>
+        <w:rPr>
+          <w:rStyle w:val="VerbatimChar"/>
+        </w:rPr>
+        <w:t xml:space="preserve">│   ├── site.webmanifest   # маніфест для «Додати на головний екран» (Android)</w:t>
+      </w:r>
+      <w:r>
+        <w:br/>
+      </w:r>
+      <w:r>
+        <w:rPr>
+          <w:rStyle w:val="VerbatimChar"/>
+        </w:rPr>
+        <w:t xml:space="preserve">│   └── assets/icons/      # PNG-іконки різних розмірів (16–512px, apple-touch-icon)</w:t>
       </w:r>
       <w:r>
         <w:br/>

</xml_diff>

<commit_message>
release 0.2.2 add AD integration and doc
</commit_message>
<xml_diff>
--- a/docs/ITSM_System_Documentation.docx
+++ b/docs/ITSM_System_Documentation.docx
@@ -227,7 +227,7 @@
         <w:pStyle w:val="Compact"/>
       </w:pPr>
       <w:r>
-        <w:t xml:space="preserve">Автентифікація (локальна, сесійна), рольова модель (RBAC):</w:t>
+        <w:t xml:space="preserve">Автентифікація (локальна та через Active Directory, сесійна), рольова модель (RBAC):</w:t>
       </w:r>
       <w:r>
         <w:t xml:space="preserve"> </w:t>
@@ -318,6 +318,174 @@
       </w:r>
       <w:r>
         <w:t xml:space="preserve">) — фільтри за типом сутності/автором/датою, українські підписи, розшифровані назви замість технічних ID</w:t>
+      </w:r>
+    </w:p>
+    <w:p>
+      <w:pPr>
+        <w:numPr>
+          <w:ilvl w:val="0"/>
+          <w:numId w:val="1002"/>
+        </w:numPr>
+        <w:pStyle w:val="Compact"/>
+      </w:pPr>
+      <w:r>
+        <w:t xml:space="preserve">Інтеграція з Active Directory — вхід AD-користувачів під доменним паролем (перевіряється напряму в каталозі через bind; копія пароля в системі не зберігається; те саме блокування після невдалих спроб, що й для локальних акаунтів), фонова синхронізація користувачів (</w:t>
+      </w:r>
+      <w:r>
+        <w:rPr>
+          <w:rStyle w:val="VerbatimChar"/>
+        </w:rPr>
+        <w:t xml:space="preserve">bin/sync-ad-users.php</w:t>
+      </w:r>
+      <w:r>
+        <w:t xml:space="preserve">, cron): створення, оновлення, прив'язка до організаційного підрозділу (OU) з DN користувача, роль за відповідністю груп AD ролям, деактивація зниклих з каталогу. Локальні акаунти синхронізація не чіпає ніколи. Підключення налаштовується формою в</w:t>
+      </w:r>
+      <w:r>
+        <w:t xml:space="preserve"> </w:t>
+      </w:r>
+      <w:r>
+        <w:rPr>
+          <w:rStyle w:val="VerbatimChar"/>
+        </w:rPr>
+        <w:t xml:space="preserve">/admin/ad</w:t>
+      </w:r>
+      <w:r>
+        <w:t xml:space="preserve"> </w:t>
+      </w:r>
+      <w:r>
+        <w:t xml:space="preserve">(сервер, домен, службовий акаунт, пароль, шифрування, перевірка сертифіката) — форма сама записує значення в</w:t>
+      </w:r>
+      <w:r>
+        <w:t xml:space="preserve"> </w:t>
+      </w:r>
+      <w:r>
+        <w:rPr>
+          <w:rStyle w:val="VerbatimChar"/>
+        </w:rPr>
+        <w:t xml:space="preserve">.env</w:t>
+      </w:r>
+      <w:r>
+        <w:t xml:space="preserve">. Потребує розширення</w:t>
+      </w:r>
+      <w:r>
+        <w:t xml:space="preserve"> </w:t>
+      </w:r>
+      <w:r>
+        <w:rPr>
+          <w:rStyle w:val="VerbatimChar"/>
+        </w:rPr>
+        <w:t xml:space="preserve">ext-ldap</w:t>
+      </w:r>
+      <w:r>
+        <w:t xml:space="preserve"> </w:t>
+      </w:r>
+      <w:r>
+        <w:t xml:space="preserve">(власного LDAP-протоколу, на відміну від IMAP/SMTP, не реалізовано свідомо). Безпарольний SSO (Kerberos/NTLM) не реалізовано — вхід лише формою</w:t>
+      </w:r>
+    </w:p>
+    <w:p>
+      <w:pPr>
+        <w:numPr>
+          <w:ilvl w:val="0"/>
+          <w:numId w:val="1002"/>
+        </w:numPr>
+        <w:pStyle w:val="Compact"/>
+      </w:pPr>
+      <w:r>
+        <w:t xml:space="preserve">Content-Security-Policy — суворий</w:t>
+      </w:r>
+      <w:r>
+        <w:t xml:space="preserve"> </w:t>
+      </w:r>
+      <w:r>
+        <w:rPr>
+          <w:rStyle w:val="VerbatimChar"/>
+        </w:rPr>
+        <w:t xml:space="preserve">script-src</w:t>
+      </w:r>
+      <w:r>
+        <w:t xml:space="preserve"> </w:t>
+      </w:r>
+      <w:r>
+        <w:t xml:space="preserve">(одноразовий nonce на запит, без</w:t>
+      </w:r>
+      <w:r>
+        <w:t xml:space="preserve"> </w:t>
+      </w:r>
+      <w:r>
+        <w:rPr>
+          <w:rStyle w:val="VerbatimChar"/>
+        </w:rPr>
+        <w:t xml:space="preserve">unsafe-inline</w:t>
+      </w:r>
+      <w:r>
+        <w:t xml:space="preserve">; дозволені лише власні скрипти та два CDN — jsdelivr і cdnjs), заборона вбудовування в чужі iframe,</w:t>
+      </w:r>
+      <w:r>
+        <w:t xml:space="preserve"> </w:t>
+      </w:r>
+      <w:r>
+        <w:rPr>
+          <w:rStyle w:val="VerbatimChar"/>
+        </w:rPr>
+        <w:t xml:space="preserve">X-Content-Type-Options</w:t>
+      </w:r>
+      <w:r>
+        <w:t xml:space="preserve">,</w:t>
+      </w:r>
+      <w:r>
+        <w:t xml:space="preserve"> </w:t>
+      </w:r>
+      <w:r>
+        <w:rPr>
+          <w:rStyle w:val="VerbatimChar"/>
+        </w:rPr>
+        <w:t xml:space="preserve">Referrer-Policy</w:t>
+      </w:r>
+      <w:r>
+        <w:t xml:space="preserve">. Усі вбудовані обробники подій (</w:t>
+      </w:r>
+      <w:r>
+        <w:rPr>
+          <w:rStyle w:val="VerbatimChar"/>
+        </w:rPr>
+        <w:t xml:space="preserve">onclick=</w:t>
+      </w:r>
+      <w:r>
+        <w:t xml:space="preserve"> </w:t>
+      </w:r>
+      <w:r>
+        <w:t xml:space="preserve">тощо) замінено двома делегованими:</w:t>
+      </w:r>
+      <w:r>
+        <w:t xml:space="preserve"> </w:t>
+      </w:r>
+      <w:r>
+        <w:rPr>
+          <w:rStyle w:val="VerbatimChar"/>
+        </w:rPr>
+        <w:t xml:space="preserve">data-confirm</w:t>
+      </w:r>
+      <w:r>
+        <w:t xml:space="preserve"> </w:t>
+      </w:r>
+      <w:r>
+        <w:t xml:space="preserve">на формах (діалог підтвердження) і клас</w:t>
+      </w:r>
+      <w:r>
+        <w:t xml:space="preserve"> </w:t>
+      </w:r>
+      <w:r>
+        <w:rPr>
+          <w:rStyle w:val="VerbatimChar"/>
+        </w:rPr>
+        <w:t xml:space="preserve">.auto-submit-select</w:t>
+      </w:r>
+      <w:r>
+        <w:t xml:space="preserve"> </w:t>
+      </w:r>
+      <w:r>
+        <w:t xml:space="preserve">на списках (миттєве надсилання форми)</w:t>
       </w:r>
     </w:p>
     <w:p>
@@ -756,7 +924,7 @@
         <w:t xml:space="preserve">bin/send-reminders.php</w:t>
       </w:r>
       <w:r>
-        <w:t xml:space="preserve">). Кожна невдала спроба надсилання (SMTP недоступний тощо) фіксується в журналі аудиту з адресою й причиною, а не губиться мовчки</w:t>
+        <w:t xml:space="preserve">). Вмикаються чотирма незалежними перемикачами (тікети / проєкти / задачі / нагадування). Кожна невдала спроба надсилання (SMTP недоступний тощо) фіксується в журналі аудиту з адресою й причиною, а не губиться мовчки</w:t>
       </w:r>
     </w:p>
     <w:p>
@@ -811,6 +979,42 @@
       </w:r>
       <w:r>
         <w:t xml:space="preserve">для черги) позначаються бейджем у списку тікетів (прострочені піднімаються вгору списку) і детально на сторінці самого тікета та на публічній сторінці відстеження; закритий тікет прострочення не показує. Нормативи (хвилини на першу відповідь і на вирішення) налаштовуються для кожної черги в Адмін-панель → Черги тікетів, зміни фіксуються в журналі аудиту</w:t>
+      </w:r>
+    </w:p>
+    <w:p>
+      <w:pPr>
+        <w:numPr>
+          <w:ilvl w:val="0"/>
+          <w:numId w:val="1004"/>
+        </w:numPr>
+        <w:pStyle w:val="Compact"/>
+      </w:pPr>
+      <w:r>
+        <w:t xml:space="preserve">Оцінка якості (CSAT, 1–5) — не лише на порталі, а й для залогінених заявників на сторінці їхнього тікета (після статусу «Вирішено»/«Закрито», один раз, лише сам заявник — оператор і адміністратор оцінку лише бачать). Зведений звіт —</w:t>
+      </w:r>
+      <w:r>
+        <w:t xml:space="preserve"> </w:t>
+      </w:r>
+      <w:r>
+        <w:rPr>
+          <w:rStyle w:val="VerbatimChar"/>
+        </w:rPr>
+        <w:t xml:space="preserve">/admin/csat</w:t>
+      </w:r>
+      <w:r>
+        <w:t xml:space="preserve">: середня оцінка, розподіл 1–5, розбивка по чергах і операторах, останні оцінки</w:t>
+      </w:r>
+    </w:p>
+    <w:p>
+      <w:pPr>
+        <w:numPr>
+          <w:ilvl w:val="0"/>
+          <w:numId w:val="1004"/>
+        </w:numPr>
+        <w:pStyle w:val="Compact"/>
+      </w:pPr>
+      <w:r>
+        <w:t xml:space="preserve">Автопризначення оператора для черги — у Адмін-панель → Черги тікетів для кожної черги можна вказати оператора, який одразу призначається на кожен новий тікет у ній; працює однаково для звичайної форми, порталу самообслуговування й email-to-ticket</w:t>
       </w:r>
     </w:p>
     <w:p>
@@ -930,7 +1134,7 @@
         <w:pStyle w:val="Compact"/>
       </w:pPr>
       <w:r>
-        <w:t xml:space="preserve">Керування користувачами (створення, редагування, зміна пароля, активація/деактивація, зняття блокування, видалення за відсутності пов'язаних даних)</w:t>
+        <w:t xml:space="preserve">Керування користувачами (створення, редагування, зміна пароля, активація/деактивація, зняття блокування, видалення за відсутності пов'язаних даних); список розділено на локальні акаунти й акаунти Active Directory, а AD-акаунти ще й згруповано за організаційними підрозділами (OU)</w:t>
       </w:r>
     </w:p>
     <w:p>
@@ -975,7 +1179,49 @@
         <w:pStyle w:val="Compact"/>
       </w:pPr>
       <w:r>
-        <w:t xml:space="preserve">Створення черг тікетів</w:t>
+        <w:t xml:space="preserve">Керування чергами тікетів: створення, SLA-нормативи, автопризначення оператора</w:t>
+      </w:r>
+    </w:p>
+    <w:p>
+      <w:pPr>
+        <w:numPr>
+          <w:ilvl w:val="0"/>
+          <w:numId w:val="1006"/>
+        </w:numPr>
+        <w:pStyle w:val="Compact"/>
+      </w:pPr>
+      <w:r>
+        <w:t xml:space="preserve">Active Directory (</w:t>
+      </w:r>
+      <w:r>
+        <w:rPr>
+          <w:rStyle w:val="VerbatimChar"/>
+        </w:rPr>
+        <w:t xml:space="preserve">/admin/ad</w:t>
+      </w:r>
+      <w:r>
+        <w:t xml:space="preserve">): підключення, перевірка з'єднання, синхронізація, відповідність груп ролям</w:t>
+      </w:r>
+    </w:p>
+    <w:p>
+      <w:pPr>
+        <w:numPr>
+          <w:ilvl w:val="0"/>
+          <w:numId w:val="1006"/>
+        </w:numPr>
+        <w:pStyle w:val="Compact"/>
+      </w:pPr>
+      <w:r>
+        <w:t xml:space="preserve">Звіт CSAT (</w:t>
+      </w:r>
+      <w:r>
+        <w:rPr>
+          <w:rStyle w:val="VerbatimChar"/>
+        </w:rPr>
+        <w:t xml:space="preserve">/admin/csat</w:t>
+      </w:r>
+      <w:r>
+        <w:t xml:space="preserve">)</w:t>
       </w:r>
     </w:p>
     <w:bookmarkEnd w:id="23"/>
@@ -1009,25 +1255,13 @@
           <w:bCs/>
           <w:b/>
         </w:rPr>
-        <w:t xml:space="preserve">Інтеграція з Active Directory</w:t>
-      </w:r>
-      <w:r>
-        <w:t xml:space="preserve"> </w:t>
-      </w:r>
-      <w:r>
-        <w:t xml:space="preserve">— автоматична синхронізація користувачів, SSO (Епік 13; точка розширення вже позначена в</w:t>
-      </w:r>
-      <w:r>
-        <w:t xml:space="preserve"> </w:t>
-      </w:r>
-      <w:r>
-        <w:rPr>
-          <w:rStyle w:val="VerbatimChar"/>
-        </w:rPr>
-        <w:t xml:space="preserve">App\Core\Auth::attempt()</w:t>
-      </w:r>
-      <w:r>
-        <w:t xml:space="preserve">)</w:t>
+        <w:t xml:space="preserve">Вебхуки, REST API</w:t>
+      </w:r>
+      <w:r>
+        <w:t xml:space="preserve"> </w:t>
+      </w:r>
+      <w:r>
+        <w:t xml:space="preserve">— зовнішні системи поки не можуть ні отримувати події з ITSM, ні звертатись до нього програмно</w:t>
       </w:r>
     </w:p>
     <w:p>
@@ -1043,13 +1277,13 @@
           <w:bCs/>
           <w:b/>
         </w:rPr>
-        <w:t xml:space="preserve">Вебхуки, REST API</w:t>
-      </w:r>
-      <w:r>
-        <w:t xml:space="preserve"> </w:t>
-      </w:r>
-      <w:r>
-        <w:t xml:space="preserve">(email-сповіщення та автовідповідь заявнику вже реалізовані)</w:t>
+        <w:t xml:space="preserve">Wiki, форуми, файлові документи</w:t>
+      </w:r>
+      <w:r>
+        <w:t xml:space="preserve"> </w:t>
+      </w:r>
+      <w:r>
+        <w:t xml:space="preserve">як окремий модуль (Епіки 6–8; після цього — збереження вкладень з листів)</w:t>
       </w:r>
     </w:p>
     <w:p>
@@ -1065,13 +1299,13 @@
           <w:bCs/>
           <w:b/>
         </w:rPr>
-        <w:t xml:space="preserve">Wiki, форуми, файлові документи</w:t>
-      </w:r>
-      <w:r>
-        <w:t xml:space="preserve"> </w:t>
-      </w:r>
-      <w:r>
-        <w:t xml:space="preserve">як окремий модуль (Епіки 6–8; після цього — збереження вкладень з листів)</w:t>
+        <w:t xml:space="preserve">Безпарольний SSO для Active Directory</w:t>
+      </w:r>
+      <w:r>
+        <w:t xml:space="preserve"> </w:t>
+      </w:r>
+      <w:r>
+        <w:t xml:space="preserve">(Kerberos/NTLM — вхід без форми); зараз вхід AD-користувача лише формою з доменним паролем</w:t>
       </w:r>
     </w:p>
     <w:p>
@@ -1091,7 +1325,16 @@
         <w:pStyle w:val="Compact"/>
       </w:pPr>
       <w:r>
-        <w:t xml:space="preserve">Гранульовані перемикачі email-сповіщень (окремо тікети/проєкти/задачі/нагадування) — зараз одна спільна галочка на все</w:t>
+        <w:t xml:space="preserve">Прив'язка AD-користувачів за стабільним ідентифікатором (</w:t>
+      </w:r>
+      <w:r>
+        <w:rPr>
+          <w:rStyle w:val="VerbatimChar"/>
+        </w:rPr>
+        <w:t xml:space="preserve">objectGUID</w:t>
+      </w:r>
+      <w:r>
+        <w:t xml:space="preserve">) замість email: зараз, якщо AD змінить людині email, наступна синхронізація створить новий обліковий запис замість оновлення старого</w:t>
       </w:r>
     </w:p>
     <w:p>
@@ -1103,7 +1346,46 @@
         <w:pStyle w:val="Compact"/>
       </w:pPr>
       <w:r>
-        <w:t xml:space="preserve">CSP-заголовки</w:t>
+        <w:t xml:space="preserve">Дозвіл ручного перевизначення ролі чи деактивації AD-користувача, яке синхронізація не скасовує (зараз вона щоразу виставляє роль за групами AD і повторно активує користувача, що ще є в каталозі)</w:t>
+      </w:r>
+    </w:p>
+    <w:p>
+      <w:pPr>
+        <w:numPr>
+          <w:ilvl w:val="0"/>
+          <w:numId w:val="1008"/>
+        </w:numPr>
+        <w:pStyle w:val="Compact"/>
+      </w:pPr>
+      <w:r>
+        <w:t xml:space="preserve">LDAPS і нестандартний порт у формі</w:t>
+      </w:r>
+      <w:r>
+        <w:t xml:space="preserve"> </w:t>
+      </w:r>
+      <w:r>
+        <w:rPr>
+          <w:rStyle w:val="VerbatimChar"/>
+        </w:rPr>
+        <w:t xml:space="preserve">/admin/ad</w:t>
+      </w:r>
+      <w:r>
+        <w:t xml:space="preserve"> </w:t>
+      </w:r>
+      <w:r>
+        <w:t xml:space="preserve">(зараз — лише вручну в</w:t>
+      </w:r>
+      <w:r>
+        <w:t xml:space="preserve"> </w:t>
+      </w:r>
+      <w:r>
+        <w:rPr>
+          <w:rStyle w:val="VerbatimChar"/>
+        </w:rPr>
+        <w:t xml:space="preserve">.env</w:t>
+      </w:r>
+      <w:r>
+        <w:t xml:space="preserve">; форма розрахована на STARTTLS/без шифрування, порт 389)</w:t>
       </w:r>
     </w:p>
     <w:p>
@@ -1305,6 +1587,66 @@
         <w:t xml:space="preserve">(нагадування про термін)</w:t>
       </w:r>
     </w:p>
+    <w:p>
+      <w:pPr>
+        <w:numPr>
+          <w:ilvl w:val="0"/>
+          <w:numId w:val="1009"/>
+        </w:numPr>
+        <w:pStyle w:val="Compact"/>
+      </w:pPr>
+      <w:r>
+        <w:t xml:space="preserve">Для Active Directory (необов'язково): розширення PHP</w:t>
+      </w:r>
+      <w:r>
+        <w:t xml:space="preserve"> </w:t>
+      </w:r>
+      <w:r>
+        <w:rPr>
+          <w:rStyle w:val="VerbatimChar"/>
+        </w:rPr>
+        <w:t xml:space="preserve">ldap</w:t>
+      </w:r>
+      <w:r>
+        <w:t xml:space="preserve"> </w:t>
+      </w:r>
+      <w:r>
+        <w:t xml:space="preserve">(</w:t>
+      </w:r>
+      <w:r>
+        <w:rPr>
+          <w:rStyle w:val="VerbatimChar"/>
+        </w:rPr>
+        <w:t xml:space="preserve">apt install php-ldap</w:t>
+      </w:r>
+      <w:r>
+        <w:t xml:space="preserve">), доступ сервера до контролера домену (порт 389 або 636) і</w:t>
+      </w:r>
+      <w:r>
+        <w:t xml:space="preserve"> </w:t>
+      </w:r>
+      <w:r>
+        <w:rPr>
+          <w:rStyle w:val="VerbatimChar"/>
+        </w:rPr>
+        <w:t xml:space="preserve">cron</w:t>
+      </w:r>
+      <w:r>
+        <w:t xml:space="preserve"> </w:t>
+      </w:r>
+      <w:r>
+        <w:t xml:space="preserve">для</w:t>
+      </w:r>
+      <w:r>
+        <w:t xml:space="preserve"> </w:t>
+      </w:r>
+      <w:r>
+        <w:rPr>
+          <w:rStyle w:val="VerbatimChar"/>
+        </w:rPr>
+        <w:t xml:space="preserve">bin/sync-ad-users.php</w:t>
+      </w:r>
+    </w:p>
     <w:bookmarkEnd w:id="25"/>
     <w:bookmarkStart w:id="26" w:name="оновлення-вже-розгорнутої-системи"/>
     <w:p>
@@ -1406,7 +1748,7 @@
         <w:pStyle w:val="FirstParagraph"/>
       </w:pPr>
       <w:r>
-        <w:t xml:space="preserve">Скрипт послідовно перевіряє й, за потреби, виправляє: кодування кирилиці, колонку «відповідальний за проєкт», колонку «дата початку задачі», таблицю етапів дорожньої карти, індекси для звітів обліку часу й журналу аудиту, таблицю/колонки для блокування входу, колонку прив'язки тікета до проєкту, колонку токена доступу для порталу самообслуговування, унікальність SLA-нормативу на чергу, таблицю журналу обробки пошти, налаштування автовідповіді заявнику, таблицю нагадувань про термін і налаштування email-сповіщень, застарілий кеш шрифтів PDF-звітів, і насамкінець — права доступу до файлів. Безпечний для повторного запуску — якщо виправляти нічого, просто про це повідомить.</w:t>
+        <w:t xml:space="preserve">Скрипт послідовно перевіряє й, за потреби, виправляє: кодування кирилиці, колонку «відповідальний за проєкт», колонку «дата початку задачі», таблицю етапів дорожньої карти, індекси для звітів обліку часу й журналу аудиту, таблицю/колонки для блокування входу, колонку прив'язки тікета до проєкту, колонку токена доступу для порталу самообслуговування, унікальність SLA-нормативу на чергу, таблицю журналу обробки пошти, налаштування автовідповіді заявнику, таблицю нагадувань про термін, гранульовані перемикачі email-сповіщень, колонку автопризначення оператора для черги, колонки й таблицю для Active Directory (AD-логін, OU, відповідність груп ролям), застарілий кеш шрифтів PDF-звітів, і насамкінець — права доступу до файлів. Безпечний для повторного запуску — якщо виправляти нічого, просто про це повідомить.</w:t>
       </w:r>
     </w:p>
     <w:bookmarkEnd w:id="26"/>
@@ -3754,29 +4096,9 @@
     </w:p>
     <w:p>
       <w:pPr>
-        <w:pStyle w:val="FirstParagraph"/>
-      </w:pPr>
-      <w:r>
-        <w:t xml:space="preserve">Відомі обмеження (свідомо поза межами MVP, див. «Наступні кроки розробки»):</w:t>
-      </w:r>
-    </w:p>
-    <w:p>
-      <w:pPr>
-        <w:numPr>
-          <w:ilvl w:val="0"/>
-          <w:numId w:val="1014"/>
-        </w:numPr>
-        <w:pStyle w:val="Compact"/>
-      </w:pPr>
-      <w:r>
-        <w:t xml:space="preserve">Немає CSP-заголовків.</w:t>
-      </w:r>
-    </w:p>
-    <w:p>
-      <w:pPr>
-        <w:numPr>
-          <w:ilvl w:val="0"/>
-          <w:numId w:val="1014"/>
+        <w:numPr>
+          <w:ilvl w:val="0"/>
+          <w:numId w:val="1013"/>
         </w:numPr>
         <w:pStyle w:val="Compact"/>
       </w:pPr>
@@ -3785,129 +4107,78 @@
           <w:bCs/>
           <w:b/>
         </w:rPr>
-        <w:t xml:space="preserve">Email-to-ticket не перевіряє справжність відправника</w:t>
-      </w:r>
-      <w:r>
-        <w:t xml:space="preserve"> </w:t>
-      </w:r>
-      <w:r>
-        <w:t xml:space="preserve">(SPF/DKIM не аналізуються): будь-хто може написати листа з адресою співробітника, і тікет буде прив'язано до його облікового запису. Покладайтесь на антиспам-фільтрацію та SPF/DKIM-перевірку на самому поштовому сервері перед скринькою підтримки.</w:t>
-      </w:r>
-    </w:p>
-    <w:p>
-      <w:pPr>
-        <w:numPr>
-          <w:ilvl w:val="0"/>
-          <w:numId w:val="1014"/>
-        </w:numPr>
-        <w:pStyle w:val="Compact"/>
-      </w:pPr>
-      <w:r>
-        <w:t xml:space="preserve">Немає обмеження частоти запитів (rate limiting) на публічну форму</w:t>
-      </w:r>
-      <w:r>
-        <w:t xml:space="preserve"> </w:t>
-      </w:r>
-      <w:r>
-        <w:rPr>
-          <w:rStyle w:val="VerbatimChar"/>
-        </w:rPr>
-        <w:t xml:space="preserve">/support</w:t>
-      </w:r>
-      <w:r>
-        <w:t xml:space="preserve"> </w:t>
-      </w:r>
-      <w:r>
-        <w:t xml:space="preserve">— лише пастка для найпростіших ботів; захисту від цілеспрямованого спаму людиною чи складнішим ботом поки немає.</w:t>
-      </w:r>
-    </w:p>
-    <w:p>
-      <w:pPr>
-        <w:numPr>
-          <w:ilvl w:val="0"/>
-          <w:numId w:val="1014"/>
-        </w:numPr>
-        <w:pStyle w:val="Compact"/>
-      </w:pPr>
-      <w:r>
-        <w:t xml:space="preserve">Сесії зберігаються файлово — для кількох веб-серверів за балансувальником знадобиться спільне сховище.</w:t>
-      </w:r>
-    </w:p>
-    <w:p>
-      <w:pPr>
-        <w:numPr>
-          <w:ilvl w:val="0"/>
-          <w:numId w:val="1014"/>
-        </w:numPr>
-        <w:pStyle w:val="Compact"/>
-      </w:pPr>
-      <w:r>
-        <w:t xml:space="preserve">Оператор служби підтримки та керівник ІТ (якщо не адміністратор) бачать лише тікети, де вони заявник або вже призначений оператор — не можуть переглянути чергу непризначених тікетів.</w:t>
-      </w:r>
-    </w:p>
-    <w:p>
-      <w:pPr>
-        <w:numPr>
-          <w:ilvl w:val="0"/>
-          <w:numId w:val="1014"/>
-        </w:numPr>
-        <w:pStyle w:val="Compact"/>
-      </w:pPr>
+        <w:t xml:space="preserve">Active Directory</w:t>
+      </w:r>
+      <w:r>
+        <w:t xml:space="preserve"> </w:t>
+      </w:r>
+      <w:r>
+        <w:t xml:space="preserve">— службовий обліковий запис потрібен лише для читання каталогу (не адміністратор домену); сам вхід — окремий bind як сам користувач, пароль ніде не зберігається; ім'я користувача підставляється в LDAP-фільтр з екрануванням спецсимволів (RFC 4515) — логін на кшталт</w:t>
+      </w:r>
+      <w:r>
+        <w:t xml:space="preserve"> </w:t>
+      </w:r>
+      <w:r>
+        <w:rPr>
+          <w:rStyle w:val="VerbatimChar"/>
+        </w:rPr>
+        <w:t xml:space="preserve">*)(uid=*</w:t>
+      </w:r>
+      <w:r>
+        <w:t xml:space="preserve"> </w:t>
+      </w:r>
+      <w:r>
+        <w:t xml:space="preserve">не підміняє фільтр; порожній пароль відхиляється явно (за специфікацією LDAP він означає анонімний bind і сервер повернув би «успіх»); локальні облікові записи ніколи не перехоплюються через збіг email з AD-записом; пароль службового акаунта лише в</w:t>
+      </w:r>
+      <w:r>
+        <w:t xml:space="preserve"> </w:t>
+      </w:r>
+      <w:r>
+        <w:rPr>
+          <w:rStyle w:val="VerbatimChar"/>
+        </w:rPr>
+        <w:t xml:space="preserve">.env</w:t>
+      </w:r>
+      <w:r>
+        <w:t xml:space="preserve">, ніколи не підставляється назад у форму й не потрапляє в журнал аудиту. Пошук у каталозі постраничний (обмеження AD у 1000 записів на запит не діє); якщо сервер усе ж віддав неповний результат, синхронізація скасовується з помилкою й</w:t>
+      </w:r>
+      <w:r>
+        <w:t xml:space="preserve"> </w:t>
+      </w:r>
       <w:r>
         <w:rPr>
           <w:bCs/>
           <w:b/>
         </w:rPr>
-        <w:t xml:space="preserve">Bootstrap і Frappe Gantt</w:t>
-      </w:r>
-      <w:r>
-        <w:t xml:space="preserve"> </w:t>
-      </w:r>
-      <w:r>
-        <w:t xml:space="preserve">підключені з CDN (</w:t>
-      </w:r>
-      <w:r>
-        <w:rPr>
-          <w:rStyle w:val="VerbatimChar"/>
-        </w:rPr>
-        <w:t xml:space="preserve">jsdelivr.net</w:t>
-      </w:r>
-      <w:r>
-        <w:t xml:space="preserve">,</w:t>
-      </w:r>
-      <w:r>
-        <w:t xml:space="preserve"> </w:t>
-      </w:r>
-      <w:r>
-        <w:rPr>
-          <w:rStyle w:val="VerbatimChar"/>
-        </w:rPr>
-        <w:t xml:space="preserve">cdnjs.cloudflare.com</w:t>
-      </w:r>
-      <w:r>
-        <w:t xml:space="preserve">) — потрібен доступ сервера/браузера до інтернету. Якщо мережа повністю ізольована — верстка Bootstrap та сторінка</w:t>
-      </w:r>
-      <w:r>
-        <w:t xml:space="preserve"> </w:t>
-      </w:r>
-      <w:r>
-        <w:rPr>
-          <w:rStyle w:val="VerbatimChar"/>
-        </w:rPr>
-        <w:t xml:space="preserve">/gantt</w:t>
-      </w:r>
-      <w:r>
-        <w:t xml:space="preserve"> </w:t>
-      </w:r>
-      <w:r>
-        <w:t xml:space="preserve">не завантажаться, решта функціоналу не постраждає.</w:t>
-      </w:r>
-    </w:p>
-    <w:p>
-      <w:pPr>
-        <w:numPr>
-          <w:ilvl w:val="0"/>
-          <w:numId w:val="1014"/>
+        <w:t xml:space="preserve">нікого не деактивує</w:t>
+      </w:r>
+      <w:r>
+        <w:t xml:space="preserve"> </w:t>
+      </w:r>
+      <w:r>
+        <w:t xml:space="preserve">— вона не діє на підставі неповних даних. Відсутнє розширення</w:t>
+      </w:r>
+      <w:r>
+        <w:t xml:space="preserve"> </w:t>
+      </w:r>
+      <w:r>
+        <w:rPr>
+          <w:rStyle w:val="VerbatimChar"/>
+        </w:rPr>
+        <w:t xml:space="preserve">ldap</w:t>
+      </w:r>
+      <w:r>
+        <w:t xml:space="preserve"> </w:t>
+      </w:r>
+      <w:r>
+        <w:t xml:space="preserve">дає зрозуміле повідомлення адміністратору, а не помилку 500.</w:t>
+      </w:r>
+    </w:p>
+    <w:p>
+      <w:pPr>
+        <w:numPr>
+          <w:ilvl w:val="0"/>
+          <w:numId w:val="1013"/>
         </w:numPr>
         <w:pStyle w:val="Compact"/>
       </w:pPr>
@@ -3916,6 +4187,392 @@
           <w:bCs/>
           <w:b/>
         </w:rPr>
+        <w:t xml:space="preserve">Запис</w:t>
+      </w:r>
+      <w:r>
+        <w:rPr>
+          <w:bCs/>
+          <w:b/>
+        </w:rPr>
+        <w:t xml:space="preserve"> </w:t>
+      </w:r>
+      <w:r>
+        <w:rPr>
+          <w:rStyle w:val="VerbatimChar"/>
+          <w:bCs/>
+          <w:b/>
+        </w:rPr>
+        <w:t xml:space="preserve">.env</w:t>
+      </w:r>
+      <w:r>
+        <w:rPr>
+          <w:bCs/>
+          <w:b/>
+        </w:rPr>
+        <w:t xml:space="preserve"> </w:t>
+      </w:r>
+      <w:r>
+        <w:rPr>
+          <w:bCs/>
+          <w:b/>
+        </w:rPr>
+        <w:t xml:space="preserve">з веб-форми</w:t>
+      </w:r>
+      <w:r>
+        <w:t xml:space="preserve"> </w:t>
+      </w:r>
+      <w:r>
+        <w:t xml:space="preserve">(</w:t>
+      </w:r>
+      <w:r>
+        <w:rPr>
+          <w:rStyle w:val="VerbatimChar"/>
+        </w:rPr>
+        <w:t xml:space="preserve">/admin/ad</w:t>
+      </w:r>
+      <w:r>
+        <w:t xml:space="preserve">) — доступний лише адміністратору; запис атомарний (тимчасовий файл + rename), решта файлу не змінюється. Щоб форма працювала, процес веб-сервера має мати право запису в</w:t>
+      </w:r>
+      <w:r>
+        <w:t xml:space="preserve"> </w:t>
+      </w:r>
+      <w:r>
+        <w:rPr>
+          <w:rStyle w:val="VerbatimChar"/>
+        </w:rPr>
+        <w:t xml:space="preserve">.env</w:t>
+      </w:r>
+      <w:r>
+        <w:t xml:space="preserve">, а</w:t>
+      </w:r>
+      <w:r>
+        <w:t xml:space="preserve"> </w:t>
+      </w:r>
+      <w:r>
+        <w:rPr>
+          <w:rStyle w:val="VerbatimChar"/>
+        </w:rPr>
+        <w:t xml:space="preserve">install.sh</w:t>
+      </w:r>
+      <w:r>
+        <w:t xml:space="preserve"> </w:t>
+      </w:r>
+      <w:r>
+        <w:t xml:space="preserve">за замовчуванням видає</w:t>
+      </w:r>
+      <w:r>
+        <w:t xml:space="preserve"> </w:t>
+      </w:r>
+      <w:r>
+        <w:rPr>
+          <w:rStyle w:val="VerbatimChar"/>
+        </w:rPr>
+        <w:t xml:space="preserve">600</w:t>
+      </w:r>
+      <w:r>
+        <w:t xml:space="preserve"> </w:t>
+      </w:r>
+      <w:r>
+        <w:t xml:space="preserve">власнику-інсталятору. Надати право запису — свідомий компроміс (файл містить і пароль БД); альтернатива — лишити права як є й редагувати</w:t>
+      </w:r>
+      <w:r>
+        <w:t xml:space="preserve"> </w:t>
+      </w:r>
+      <w:r>
+        <w:rPr>
+          <w:rStyle w:val="VerbatimChar"/>
+        </w:rPr>
+        <w:t xml:space="preserve">.env</w:t>
+      </w:r>
+      <w:r>
+        <w:t xml:space="preserve"> </w:t>
+      </w:r>
+      <w:r>
+        <w:t xml:space="preserve">вручну. Якщо запису немає, форма покаже точну команду для виправлення.</w:t>
+      </w:r>
+    </w:p>
+    <w:p>
+      <w:pPr>
+        <w:numPr>
+          <w:ilvl w:val="0"/>
+          <w:numId w:val="1013"/>
+        </w:numPr>
+        <w:pStyle w:val="Compact"/>
+      </w:pPr>
+      <w:r>
+        <w:rPr>
+          <w:bCs/>
+          <w:b/>
+        </w:rPr>
+        <w:t xml:space="preserve">Content-Security-Policy</w:t>
+      </w:r>
+      <w:r>
+        <w:t xml:space="preserve"> </w:t>
+      </w:r>
+      <w:r>
+        <w:t xml:space="preserve">—</w:t>
+      </w:r>
+      <w:r>
+        <w:t xml:space="preserve"> </w:t>
+      </w:r>
+      <w:r>
+        <w:rPr>
+          <w:rStyle w:val="VerbatimChar"/>
+        </w:rPr>
+        <w:t xml:space="preserve">script-src</w:t>
+      </w:r>
+      <w:r>
+        <w:t xml:space="preserve"> </w:t>
+      </w:r>
+      <w:r>
+        <w:t xml:space="preserve">суворий (nonce, без</w:t>
+      </w:r>
+      <w:r>
+        <w:t xml:space="preserve"> </w:t>
+      </w:r>
+      <w:r>
+        <w:rPr>
+          <w:rStyle w:val="VerbatimChar"/>
+        </w:rPr>
+        <w:t xml:space="preserve">unsafe-inline</w:t>
+      </w:r>
+      <w:r>
+        <w:t xml:space="preserve">), тож впроваджений у сторінку чужий</w:t>
+      </w:r>
+      <w:r>
+        <w:t xml:space="preserve"> </w:t>
+      </w:r>
+      <w:r>
+        <w:rPr>
+          <w:rStyle w:val="VerbatimChar"/>
+        </w:rPr>
+        <w:t xml:space="preserve">&lt;script&gt;</w:t>
+      </w:r>
+      <w:r>
+        <w:t xml:space="preserve"> </w:t>
+      </w:r>
+      <w:r>
+        <w:t xml:space="preserve">або обробник</w:t>
+      </w:r>
+      <w:r>
+        <w:t xml:space="preserve"> </w:t>
+      </w:r>
+      <w:r>
+        <w:rPr>
+          <w:rStyle w:val="VerbatimChar"/>
+        </w:rPr>
+        <w:t xml:space="preserve">onclick=</w:t>
+      </w:r>
+      <w:r>
+        <w:t xml:space="preserve"> </w:t>
+      </w:r>
+      <w:r>
+        <w:t xml:space="preserve">не виконається.</w:t>
+      </w:r>
+      <w:r>
+        <w:t xml:space="preserve"> </w:t>
+      </w:r>
+      <w:r>
+        <w:rPr>
+          <w:rStyle w:val="VerbatimChar"/>
+        </w:rPr>
+        <w:t xml:space="preserve">style-src</w:t>
+      </w:r>
+      <w:r>
+        <w:t xml:space="preserve"> </w:t>
+      </w:r>
+      <w:r>
+        <w:t xml:space="preserve">лишає</w:t>
+      </w:r>
+      <w:r>
+        <w:t xml:space="preserve"> </w:t>
+      </w:r>
+      <w:r>
+        <w:rPr>
+          <w:rStyle w:val="VerbatimChar"/>
+        </w:rPr>
+        <w:t xml:space="preserve">'unsafe-inline'</w:t>
+      </w:r>
+      <w:r>
+        <w:t xml:space="preserve"> </w:t>
+      </w:r>
+      <w:r>
+        <w:t xml:space="preserve">(кілька динамічних інлайн-стилів, наприклад смужки прогресу) — ризик значно нижчий, ніж для скриптів. Дозволені CDN (</w:t>
+      </w:r>
+      <w:r>
+        <w:rPr>
+          <w:rStyle w:val="VerbatimChar"/>
+        </w:rPr>
+        <w:t xml:space="preserve">jsdelivr.net</w:t>
+      </w:r>
+      <w:r>
+        <w:t xml:space="preserve">,</w:t>
+      </w:r>
+      <w:r>
+        <w:t xml:space="preserve"> </w:t>
+      </w:r>
+      <w:r>
+        <w:rPr>
+          <w:rStyle w:val="VerbatimChar"/>
+        </w:rPr>
+        <w:t xml:space="preserve">cdnjs.cloudflare.com</w:t>
+      </w:r>
+      <w:r>
+        <w:t xml:space="preserve">) прописані в</w:t>
+      </w:r>
+      <w:r>
+        <w:t xml:space="preserve"> </w:t>
+      </w:r>
+      <w:r>
+        <w:rPr>
+          <w:rStyle w:val="VerbatimChar"/>
+        </w:rPr>
+        <w:t xml:space="preserve">App\Core\Csp</w:t>
+      </w:r>
+      <w:r>
+        <w:t xml:space="preserve">; підключення іншого CDN чи власного дзеркала вимагає правки цього класу.</w:t>
+      </w:r>
+    </w:p>
+    <w:p>
+      <w:pPr>
+        <w:pStyle w:val="FirstParagraph"/>
+      </w:pPr>
+      <w:r>
+        <w:t xml:space="preserve">Відомі обмеження (свідомо поза межами MVP, див. «Наступні кроки розробки»):</w:t>
+      </w:r>
+    </w:p>
+    <w:p>
+      <w:pPr>
+        <w:numPr>
+          <w:ilvl w:val="0"/>
+          <w:numId w:val="1014"/>
+        </w:numPr>
+        <w:pStyle w:val="Compact"/>
+      </w:pPr>
+      <w:r>
+        <w:rPr>
+          <w:bCs/>
+          <w:b/>
+        </w:rPr>
+        <w:t xml:space="preserve">Email-to-ticket не перевіряє справжність відправника</w:t>
+      </w:r>
+      <w:r>
+        <w:t xml:space="preserve"> </w:t>
+      </w:r>
+      <w:r>
+        <w:t xml:space="preserve">(SPF/DKIM не аналізуються): будь-хто може написати листа з адресою співробітника, і тікет буде прив'язано до його облікового запису. Покладайтесь на антиспам-фільтрацію та SPF/DKIM-перевірку на самому поштовому сервері перед скринькою підтримки.</w:t>
+      </w:r>
+    </w:p>
+    <w:p>
+      <w:pPr>
+        <w:numPr>
+          <w:ilvl w:val="0"/>
+          <w:numId w:val="1014"/>
+        </w:numPr>
+        <w:pStyle w:val="Compact"/>
+      </w:pPr>
+      <w:r>
+        <w:t xml:space="preserve">Немає обмеження частоти запитів (rate limiting) на публічну форму</w:t>
+      </w:r>
+      <w:r>
+        <w:t xml:space="preserve"> </w:t>
+      </w:r>
+      <w:r>
+        <w:rPr>
+          <w:rStyle w:val="VerbatimChar"/>
+        </w:rPr>
+        <w:t xml:space="preserve">/support</w:t>
+      </w:r>
+      <w:r>
+        <w:t xml:space="preserve"> </w:t>
+      </w:r>
+      <w:r>
+        <w:t xml:space="preserve">— лише пастка для найпростіших ботів; захисту від цілеспрямованого спаму людиною чи складнішим ботом поки немає.</w:t>
+      </w:r>
+    </w:p>
+    <w:p>
+      <w:pPr>
+        <w:numPr>
+          <w:ilvl w:val="0"/>
+          <w:numId w:val="1014"/>
+        </w:numPr>
+        <w:pStyle w:val="Compact"/>
+      </w:pPr>
+      <w:r>
+        <w:t xml:space="preserve">Сесії зберігаються файлово — для кількох веб-серверів за балансувальником знадобиться спільне сховище.</w:t>
+      </w:r>
+    </w:p>
+    <w:p>
+      <w:pPr>
+        <w:numPr>
+          <w:ilvl w:val="0"/>
+          <w:numId w:val="1014"/>
+        </w:numPr>
+        <w:pStyle w:val="Compact"/>
+      </w:pPr>
+      <w:r>
+        <w:rPr>
+          <w:bCs/>
+          <w:b/>
+        </w:rPr>
+        <w:t xml:space="preserve">Bootstrap і Frappe Gantt</w:t>
+      </w:r>
+      <w:r>
+        <w:t xml:space="preserve"> </w:t>
+      </w:r>
+      <w:r>
+        <w:t xml:space="preserve">підключені з CDN (</w:t>
+      </w:r>
+      <w:r>
+        <w:rPr>
+          <w:rStyle w:val="VerbatimChar"/>
+        </w:rPr>
+        <w:t xml:space="preserve">jsdelivr.net</w:t>
+      </w:r>
+      <w:r>
+        <w:t xml:space="preserve">,</w:t>
+      </w:r>
+      <w:r>
+        <w:t xml:space="preserve"> </w:t>
+      </w:r>
+      <w:r>
+        <w:rPr>
+          <w:rStyle w:val="VerbatimChar"/>
+        </w:rPr>
+        <w:t xml:space="preserve">cdnjs.cloudflare.com</w:t>
+      </w:r>
+      <w:r>
+        <w:t xml:space="preserve">) — потрібен доступ сервера/браузера до інтернету. Якщо мережа повністю ізольована — верстка Bootstrap та сторінка</w:t>
+      </w:r>
+      <w:r>
+        <w:t xml:space="preserve"> </w:t>
+      </w:r>
+      <w:r>
+        <w:rPr>
+          <w:rStyle w:val="VerbatimChar"/>
+        </w:rPr>
+        <w:t xml:space="preserve">/gantt</w:t>
+      </w:r>
+      <w:r>
+        <w:t xml:space="preserve"> </w:t>
+      </w:r>
+      <w:r>
+        <w:t xml:space="preserve">не завантажаться, решта функціоналу не постраждає.</w:t>
+      </w:r>
+    </w:p>
+    <w:p>
+      <w:pPr>
+        <w:numPr>
+          <w:ilvl w:val="0"/>
+          <w:numId w:val="1014"/>
+        </w:numPr>
+        <w:pStyle w:val="Compact"/>
+      </w:pPr>
+      <w:r>
+        <w:rPr>
+          <w:bCs/>
+          <w:b/>
+        </w:rPr>
         <w:t xml:space="preserve">PDF-звіти працюють повністю офлайн</w:t>
       </w:r>
       <w:r>
@@ -3970,25 +4627,25 @@
         <w:rPr>
           <w:rStyle w:val="VerbatimChar"/>
         </w:rPr>
-        <w:t xml:space="preserve">│   ├── Controllers/     # обробники HTTP-запитів, зокрема ArchiveController (сторінка /archive)</w:t>
-      </w:r>
-      <w:r>
-        <w:br/>
-      </w:r>
-      <w:r>
-        <w:rPr>
-          <w:rStyle w:val="VerbatimChar"/>
-        </w:rPr>
-        <w:t xml:space="preserve">│   ├── Core/             # роутер, БД, конфіг, автентифікація, CSRF, рендеринг шаблонів, PdfReport (обгортка над tFPDF), ImapClient/MimeParser (email-to-ticket), SmtpClient (вихідна пошта)</w:t>
-      </w:r>
-      <w:r>
-        <w:br/>
-      </w:r>
-      <w:r>
-        <w:rPr>
-          <w:rStyle w:val="VerbatimChar"/>
-        </w:rPr>
-        <w:t xml:space="preserve">│   ├── Services/         # бізнес-логіка поза моделями (EmailTicketService — перетворення листів на тікети; MailerService — надсилання листа через SmtpClient; NotificationService — email-сповіщення про активність і нагадування)</w:t>
+        <w:t xml:space="preserve">│   ├── Controllers/     # обробники HTTP-запитів, зокрема ArchiveController (сторінка /archive) і AdController (сторінка /admin/ad)</w:t>
+      </w:r>
+      <w:r>
+        <w:br/>
+      </w:r>
+      <w:r>
+        <w:rPr>
+          <w:rStyle w:val="VerbatimChar"/>
+        </w:rPr>
+        <w:t xml:space="preserve">│   ├── Core/             # роутер, БД, конфіг, автентифікація, CSRF, рендеринг шаблонів, PdfReport (обгортка над tFPDF), ImapClient/MimeParser (email-to-ticket), SmtpClient (вихідна пошта), LdapClient/LdapDn/AdAuth (Active Directory), EnvFile (запис `.env` з форми), Csp (заголовки безпеки)</w:t>
+      </w:r>
+      <w:r>
+        <w:br/>
+      </w:r>
+      <w:r>
+        <w:rPr>
+          <w:rStyle w:val="VerbatimChar"/>
+        </w:rPr>
+        <w:t xml:space="preserve">│   ├── Services/         # бізнес-логіка поза моделями (EmailTicketService — перетворення листів на тікети; MailerService — надсилання листа через SmtpClient; NotificationService — email-сповіщення про активність і нагадування; AdSyncService — синхронізація користувачів з AD)</w:t>
       </w:r>
       <w:r>
         <w:br/>
@@ -4051,7 +4708,16 @@
         <w:rPr>
           <w:rStyle w:val="VerbatimChar"/>
         </w:rPr>
-        <w:t xml:space="preserve">│   └── send-reminders.php # CLI для cron: нагадування про термін виконання задачі</w:t>
+        <w:t xml:space="preserve">│   ├── send-reminders.php # CLI для cron: нагадування про термін виконання задачі</w:t>
+      </w:r>
+      <w:r>
+        <w:br/>
+      </w:r>
+      <w:r>
+        <w:rPr>
+          <w:rStyle w:val="VerbatimChar"/>
+        </w:rPr>
+        <w:t xml:space="preserve">│   └── sync-ad-users.php  # CLI для cron: синхронізація користувачів з Active Directory</w:t>
       </w:r>
       <w:r>
         <w:br/>
@@ -4222,7 +4888,43 @@
         <w:rPr>
           <w:rStyle w:val="VerbatimChar"/>
         </w:rPr>
-        <w:t xml:space="preserve">│       └── 013_add_email_notifications.sql</w:t>
+        <w:t xml:space="preserve">│       ├── 013_add_email_notifications.sql</w:t>
+      </w:r>
+      <w:r>
+        <w:br/>
+      </w:r>
+      <w:r>
+        <w:rPr>
+          <w:rStyle w:val="VerbatimChar"/>
+        </w:rPr>
+        <w:t xml:space="preserve">│       ├── 014_add_granular_notification_settings.sql</w:t>
+      </w:r>
+      <w:r>
+        <w:br/>
+      </w:r>
+      <w:r>
+        <w:rPr>
+          <w:rStyle w:val="VerbatimChar"/>
+        </w:rPr>
+        <w:t xml:space="preserve">│       ├── 015_add_queue_default_operator.sql</w:t>
+      </w:r>
+      <w:r>
+        <w:br/>
+      </w:r>
+      <w:r>
+        <w:rPr>
+          <w:rStyle w:val="VerbatimChar"/>
+        </w:rPr>
+        <w:t xml:space="preserve">│       ├── 016_add_active_directory.sql</w:t>
+      </w:r>
+      <w:r>
+        <w:br/>
+      </w:r>
+      <w:r>
+        <w:rPr>
+          <w:rStyle w:val="VerbatimChar"/>
+        </w:rPr>
+        <w:t xml:space="preserve">│       └── 017_add_user_ad_ou.sql</w:t>
       </w:r>
       <w:r>
         <w:br/>
@@ -4890,6 +5592,102 @@
           <w:rStyle w:val="NormalTok"/>
         </w:rPr>
         <w:t xml:space="preserve"> database/migrations/002_fix_utf8_double_encoding.sql</w:t>
+      </w:r>
+    </w:p>
+    <w:p>
+      <w:pPr>
+        <w:pStyle w:val="FirstParagraph"/>
+      </w:pPr>
+      <w:r>
+        <w:rPr>
+          <w:bCs/>
+          <w:b/>
+        </w:rPr>
+        <w:t xml:space="preserve">AD-користувач не може увійти: «Невірний email або пароль».</w:t>
+      </w:r>
+      <w:r>
+        <w:t xml:space="preserve"> </w:t>
+      </w:r>
+      <w:r>
+        <w:t xml:space="preserve">Це свідомо узагальнене повідомлення — воно однаково з'являється, коли акаунта ще немає локально, і коли пароль невірний. Найчастіша причина — синхронізація ще не створила обліковий запис: у Адмін-панель → Active Directory натисніть «Синхронізувати зараз» і перевірте, що користувач з'явився на сторінці «Користувачі» у розділі Active Directory. Вхід відбувається за</w:t>
+      </w:r>
+      <w:r>
+        <w:t xml:space="preserve"> </w:t>
+      </w:r>
+      <w:r>
+        <w:rPr>
+          <w:bCs/>
+          <w:b/>
+        </w:rPr>
+        <w:t xml:space="preserve">email</w:t>
+      </w:r>
+      <w:r>
+        <w:t xml:space="preserve"> </w:t>
+      </w:r>
+      <w:r>
+        <w:t xml:space="preserve">з цього запису (не за AD-логіном). Докладніше — у</w:t>
+      </w:r>
+      <w:r>
+        <w:t xml:space="preserve"> </w:t>
+      </w:r>
+      <w:r>
+        <w:rPr>
+          <w:rStyle w:val="VerbatimChar"/>
+        </w:rPr>
+        <w:t xml:space="preserve">docs/ADMIN_GUIDE.md</w:t>
+      </w:r>
+      <w:r>
+        <w:t xml:space="preserve">, розділ 12.</w:t>
+      </w:r>
+    </w:p>
+    <w:p>
+      <w:pPr>
+        <w:pStyle w:val="BodyText"/>
+      </w:pPr>
+      <w:r>
+        <w:rPr>
+          <w:bCs/>
+          <w:b/>
+        </w:rPr>
+        <w:t xml:space="preserve">На сторінці Active Directory: «Розширення PHP «ldap» не встановлено».</w:t>
+      </w:r>
+    </w:p>
+    <w:p>
+      <w:pPr>
+        <w:pStyle w:val="SourceCode"/>
+      </w:pPr>
+      <w:r>
+        <w:rPr>
+          <w:rStyle w:val="FunctionTok"/>
+        </w:rPr>
+        <w:t xml:space="preserve">sudo</w:t>
+      </w:r>
+      <w:r>
+        <w:rPr>
+          <w:rStyle w:val="NormalTok"/>
+        </w:rPr>
+        <w:t xml:space="preserve"> apt install php-ldap</w:t>
+      </w:r>
+      <w:r>
+        <w:br/>
+      </w:r>
+      <w:r>
+        <w:rPr>
+          <w:rStyle w:val="FunctionTok"/>
+        </w:rPr>
+        <w:t xml:space="preserve">sudo</w:t>
+      </w:r>
+      <w:r>
+        <w:rPr>
+          <w:rStyle w:val="NormalTok"/>
+        </w:rPr>
+        <w:t xml:space="preserve"> systemctl restart php8.3-fpm    </w:t>
+      </w:r>
+      <w:r>
+        <w:rPr>
+          <w:rStyle w:val="CommentTok"/>
+        </w:rPr>
+        <w:t xml:space="preserve"># або apache2 — залежно від вашого розгортання</w:t>
       </w:r>
     </w:p>
     <w:p>

</xml_diff>